<commit_message>
Update v5 contract count documentation
</commit_message>
<xml_diff>
--- a/docs/guides/V5_0_CONVERTER_RUNTIME_FLOW.docx
+++ b/docs/guides/V5_0_CONVERTER_RUNTIME_FLOW.docx
@@ -1142,6 +1142,7 @@
       </w:pPr>
       <w:bookmarkStart w:id="1" w:name="_Toc233481034"/>
       <w:r>
+        <w:lastRenderedPageBreak/>
         <w:t>Foreword</w:t>
       </w:r>
       <w:bookmarkEnd w:id="1"/>
@@ -1271,7 +1272,7 @@
               <w:rPr>
                 <w:sz w:val="16"/>
               </w:rPr>
-              <w:t>194</w:t>
+              <w:t>198</w:t>
             </w:r>
           </w:p>
         </w:tc>
@@ -2331,7 +2332,13 @@
     </w:p>
     <w:p>
       <w:r>
-        <w:t>[v5.0 contract baseline] The current v5.0 suite contains 188 executable expectations.</w:t>
+        <w:t xml:space="preserve">[v5.0 contract baseline] The current v5.0 suite contains </w:t>
+      </w:r>
+      <w:r>
+        <w:t>198 executable expectations</w:t>
+      </w:r>
+      <w:r>
+        <w:t>.</w:t>
       </w:r>
     </w:p>
     <w:tbl>

</xml_diff>

<commit_message>
Prepare v5.0 maintenance release materials
</commit_message>
<xml_diff>
--- a/docs/guides/V5_0_CONVERTER_RUNTIME_FLOW.docx
+++ b/docs/guides/V5_0_CONVERTER_RUNTIME_FLOW.docx
@@ -201,7 +201,7 @@
         <w:jc w:val="center"/>
       </w:pPr>
       <w:r>
-        <w:t>Revision date: June 27, 2026</w:t>
+        <w:t>Revision date: August 1, 2026</w:t>
       </w:r>
     </w:p>
     <w:sdt>
@@ -1272,7 +1272,7 @@
               <w:rPr>
                 <w:sz w:val="16"/>
               </w:rPr>
-              <w:t>198</w:t>
+              <w:t>227</w:t>
             </w:r>
           </w:p>
         </w:tc>

</xml_diff>